<commit_message>
feat(report-mimic): add Deadstock Dashboard pentest report and compilation scripts
</commit_message>
<xml_diff>
--- a/skills/report-mimic-synthesizer/output/BIMS_REKAP_BUDGET_FR_PENETRATION_TESTING_REPORT.docx
+++ b/skills/report-mimic-synthesizer/output/BIMS_REKAP_BUDGET_FR_PENETRATION_TESTING_REPORT.docx
@@ -48,8 +48,6 @@
       <w:tblPr>
         <w:tblW w:type="auto" w:w="0"/>
         <w:jc w:val="center"/>
-        <w:tblLayout w:type="fixed"/>
-        <w:tblLook w:firstColumn="1" w:firstRow="1" w:lastColumn="0" w:lastRow="0" w:noHBand="0" w:noVBand="1" w:val="04A0"/>
         <w:tblBorders>
           <w:top w:val="single" w:sz="4" w:space="0" w:color="CBD5E1"/>
           <w:bottom w:val="single" w:sz="4" w:space="0" w:color="CBD5E1"/>
@@ -58,6 +56,8 @@
           <w:left w:val="single" w:sz="4" w:space="0" w:color="CBD5E1"/>
           <w:right w:val="single" w:sz="4" w:space="0" w:color="CBD5E1"/>
         </w:tblBorders>
+        <w:tblLayout w:type="fixed"/>
+        <w:tblLook w:firstColumn="1" w:firstRow="1" w:lastColumn="0" w:lastRow="0" w:noHBand="0" w:noVBand="1" w:val="04A0"/>
       </w:tblPr>
       <w:tblGrid>
         <w:gridCol w:w="5234"/>
@@ -407,8 +407,6 @@
       <w:tblPr>
         <w:tblW w:type="auto" w:w="0"/>
         <w:jc w:val="center"/>
-        <w:tblLayout w:type="fixed"/>
-        <w:tblLook w:firstColumn="1" w:firstRow="1" w:lastColumn="0" w:lastRow="0" w:noHBand="0" w:noVBand="1" w:val="04A0"/>
         <w:tblBorders>
           <w:top w:val="single" w:sz="4" w:space="0" w:color="CBD5E1"/>
           <w:bottom w:val="single" w:sz="4" w:space="0" w:color="CBD5E1"/>
@@ -417,6 +415,8 @@
           <w:left w:val="single" w:sz="4" w:space="0" w:color="CBD5E1"/>
           <w:right w:val="single" w:sz="4" w:space="0" w:color="CBD5E1"/>
         </w:tblBorders>
+        <w:tblLayout w:type="fixed"/>
+        <w:tblLook w:firstColumn="1" w:firstRow="1" w:lastColumn="0" w:lastRow="0" w:noHBand="0" w:noVBand="1" w:val="04A0"/>
       </w:tblPr>
       <w:tblGrid>
         <w:gridCol w:w="5234"/>
@@ -426,14 +426,14 @@
         <w:tc>
           <w:tcPr>
             <w:tcW w:type="dxa" w:w="5400"/>
-            <w:vAlign w:val="top"/>
+            <w:shd w:fill="E0F2FE"/>
             <w:tcMar>
               <w:top w:w="120" w:type="dxa"/>
               <w:bottom w:w="120" w:type="dxa"/>
               <w:left w:w="180" w:type="dxa"/>
               <w:right w:w="180" w:type="dxa"/>
             </w:tcMar>
-            <w:shd w:fill="E0F2FE"/>
+            <w:vAlign w:val="top"/>
           </w:tcPr>
           <w:p>
             <w:pPr>
@@ -452,14 +452,14 @@
         <w:tc>
           <w:tcPr>
             <w:tcW w:type="dxa" w:w="5400"/>
-            <w:vAlign w:val="top"/>
+            <w:shd w:fill="D1FAE5"/>
             <w:tcMar>
               <w:top w:w="120" w:type="dxa"/>
               <w:bottom w:w="120" w:type="dxa"/>
               <w:left w:w="180" w:type="dxa"/>
               <w:right w:w="180" w:type="dxa"/>
             </w:tcMar>
-            <w:shd w:fill="D1FAE5"/>
+            <w:vAlign w:val="top"/>
           </w:tcPr>
           <w:p>
             <w:pPr>
@@ -480,14 +480,14 @@
         <w:tc>
           <w:tcPr>
             <w:tcW w:type="dxa" w:w="5400"/>
-            <w:vAlign w:val="top"/>
+            <w:shd w:fill="F8FAFC"/>
             <w:tcMar>
               <w:top w:w="120" w:type="dxa"/>
               <w:bottom w:w="120" w:type="dxa"/>
               <w:left w:w="180" w:type="dxa"/>
               <w:right w:w="180" w:type="dxa"/>
             </w:tcMar>
-            <w:shd w:fill="F8FAFC"/>
+            <w:vAlign w:val="top"/>
           </w:tcPr>
           <w:p>
             <w:pPr>
@@ -770,14 +770,14 @@
         <w:tc>
           <w:tcPr>
             <w:tcW w:type="dxa" w:w="5400"/>
-            <w:vAlign w:val="top"/>
+            <w:shd w:fill="FFFFFF"/>
             <w:tcMar>
               <w:top w:w="120" w:type="dxa"/>
               <w:bottom w:w="120" w:type="dxa"/>
               <w:left w:w="180" w:type="dxa"/>
               <w:right w:w="180" w:type="dxa"/>
             </w:tcMar>
-            <w:shd w:fill="FFFFFF"/>
+            <w:vAlign w:val="top"/>
           </w:tcPr>
           <w:p>
             <w:pPr>
@@ -1083,8 +1083,6 @@
       <w:tblPr>
         <w:tblW w:type="auto" w:w="0"/>
         <w:jc w:val="center"/>
-        <w:tblLayout w:type="fixed"/>
-        <w:tblLook w:firstColumn="1" w:firstRow="1" w:lastColumn="0" w:lastRow="0" w:noHBand="0" w:noVBand="1" w:val="04A0"/>
         <w:tblBorders>
           <w:top w:val="single" w:sz="4" w:space="0" w:color="CBD5E1"/>
           <w:bottom w:val="single" w:sz="4" w:space="0" w:color="CBD5E1"/>
@@ -1093,6 +1091,8 @@
           <w:left w:val="single" w:sz="4" w:space="0" w:color="CBD5E1"/>
           <w:right w:val="single" w:sz="4" w:space="0" w:color="CBD5E1"/>
         </w:tblBorders>
+        <w:tblLayout w:type="fixed"/>
+        <w:tblLook w:firstColumn="1" w:firstRow="1" w:lastColumn="0" w:lastRow="0" w:noHBand="0" w:noVBand="1" w:val="04A0"/>
       </w:tblPr>
       <w:tblGrid>
         <w:gridCol w:w="5234"/>
@@ -1102,14 +1102,14 @@
         <w:tc>
           <w:tcPr>
             <w:tcW w:type="dxa" w:w="5400"/>
-            <w:vAlign w:val="top"/>
+            <w:shd w:fill="E0F2FE"/>
             <w:tcMar>
               <w:top w:w="120" w:type="dxa"/>
               <w:bottom w:w="120" w:type="dxa"/>
               <w:left w:w="180" w:type="dxa"/>
               <w:right w:w="180" w:type="dxa"/>
             </w:tcMar>
-            <w:shd w:fill="E0F2FE"/>
+            <w:vAlign w:val="top"/>
           </w:tcPr>
           <w:p>
             <w:pPr>
@@ -1128,14 +1128,14 @@
         <w:tc>
           <w:tcPr>
             <w:tcW w:type="dxa" w:w="5400"/>
-            <w:vAlign w:val="top"/>
+            <w:shd w:fill="D1FAE5"/>
             <w:tcMar>
               <w:top w:w="120" w:type="dxa"/>
               <w:bottom w:w="120" w:type="dxa"/>
               <w:left w:w="180" w:type="dxa"/>
               <w:right w:w="180" w:type="dxa"/>
             </w:tcMar>
-            <w:shd w:fill="D1FAE5"/>
+            <w:vAlign w:val="top"/>
           </w:tcPr>
           <w:p>
             <w:pPr>
@@ -1156,14 +1156,14 @@
         <w:tc>
           <w:tcPr>
             <w:tcW w:type="dxa" w:w="5400"/>
-            <w:vAlign w:val="top"/>
+            <w:shd w:fill="F8FAFC"/>
             <w:tcMar>
               <w:top w:w="120" w:type="dxa"/>
               <w:bottom w:w="120" w:type="dxa"/>
               <w:left w:w="180" w:type="dxa"/>
               <w:right w:w="180" w:type="dxa"/>
             </w:tcMar>
-            <w:shd w:fill="F8FAFC"/>
+            <w:vAlign w:val="top"/>
           </w:tcPr>
           <w:p>
             <w:pPr>
@@ -1343,14 +1343,14 @@
         <w:tc>
           <w:tcPr>
             <w:tcW w:type="dxa" w:w="5400"/>
-            <w:vAlign w:val="top"/>
+            <w:shd w:fill="FFFFFF"/>
             <w:tcMar>
               <w:top w:w="120" w:type="dxa"/>
               <w:bottom w:w="120" w:type="dxa"/>
               <w:left w:w="180" w:type="dxa"/>
               <w:right w:w="180" w:type="dxa"/>
             </w:tcMar>
-            <w:shd w:fill="FFFFFF"/>
+            <w:vAlign w:val="top"/>
           </w:tcPr>
           <w:p>
             <w:pPr>
@@ -1553,8 +1553,6 @@
       <w:tblPr>
         <w:tblW w:type="auto" w:w="0"/>
         <w:jc w:val="center"/>
-        <w:tblLayout w:type="fixed"/>
-        <w:tblLook w:firstColumn="1" w:firstRow="1" w:lastColumn="0" w:lastRow="0" w:noHBand="0" w:noVBand="1" w:val="04A0"/>
         <w:tblBorders>
           <w:top w:val="single" w:sz="4" w:space="0" w:color="CBD5E1"/>
           <w:bottom w:val="single" w:sz="4" w:space="0" w:color="CBD5E1"/>
@@ -1563,6 +1561,8 @@
           <w:left w:val="single" w:sz="4" w:space="0" w:color="CBD5E1"/>
           <w:right w:val="single" w:sz="4" w:space="0" w:color="CBD5E1"/>
         </w:tblBorders>
+        <w:tblLayout w:type="fixed"/>
+        <w:tblLook w:firstColumn="1" w:firstRow="1" w:lastColumn="0" w:lastRow="0" w:noHBand="0" w:noVBand="1" w:val="04A0"/>
       </w:tblPr>
       <w:tblGrid>
         <w:gridCol w:w="5234"/>
@@ -1572,14 +1572,14 @@
         <w:tc>
           <w:tcPr>
             <w:tcW w:type="dxa" w:w="5400"/>
-            <w:vAlign w:val="top"/>
+            <w:shd w:fill="E0F2FE"/>
             <w:tcMar>
               <w:top w:w="120" w:type="dxa"/>
               <w:bottom w:w="120" w:type="dxa"/>
               <w:left w:w="180" w:type="dxa"/>
               <w:right w:w="180" w:type="dxa"/>
             </w:tcMar>
-            <w:shd w:fill="E0F2FE"/>
+            <w:vAlign w:val="top"/>
           </w:tcPr>
           <w:p>
             <w:pPr>
@@ -1598,14 +1598,14 @@
         <w:tc>
           <w:tcPr>
             <w:tcW w:type="dxa" w:w="5400"/>
-            <w:vAlign w:val="top"/>
+            <w:shd w:fill="D1FAE5"/>
             <w:tcMar>
               <w:top w:w="120" w:type="dxa"/>
               <w:bottom w:w="120" w:type="dxa"/>
               <w:left w:w="180" w:type="dxa"/>
               <w:right w:w="180" w:type="dxa"/>
             </w:tcMar>
-            <w:shd w:fill="D1FAE5"/>
+            <w:vAlign w:val="top"/>
           </w:tcPr>
           <w:p>
             <w:pPr>
@@ -1626,14 +1626,14 @@
         <w:tc>
           <w:tcPr>
             <w:tcW w:type="dxa" w:w="5400"/>
-            <w:vAlign w:val="top"/>
+            <w:shd w:fill="F8FAFC"/>
             <w:tcMar>
               <w:top w:w="120" w:type="dxa"/>
               <w:bottom w:w="120" w:type="dxa"/>
               <w:left w:w="180" w:type="dxa"/>
               <w:right w:w="180" w:type="dxa"/>
             </w:tcMar>
-            <w:shd w:fill="F8FAFC"/>
+            <w:vAlign w:val="top"/>
           </w:tcPr>
           <w:p>
             <w:pPr>
@@ -1811,14 +1811,14 @@
         <w:tc>
           <w:tcPr>
             <w:tcW w:type="dxa" w:w="5400"/>
-            <w:vAlign w:val="top"/>
+            <w:shd w:fill="FFFFFF"/>
             <w:tcMar>
               <w:top w:w="120" w:type="dxa"/>
               <w:bottom w:w="120" w:type="dxa"/>
               <w:left w:w="180" w:type="dxa"/>
               <w:right w:w="180" w:type="dxa"/>
             </w:tcMar>
-            <w:shd w:fill="FFFFFF"/>
+            <w:vAlign w:val="top"/>
           </w:tcPr>
           <w:p>
             <w:pPr>
@@ -2019,8 +2019,6 @@
       <w:tblPr>
         <w:tblW w:type="auto" w:w="0"/>
         <w:jc w:val="center"/>
-        <w:tblLayout w:type="fixed"/>
-        <w:tblLook w:firstColumn="1" w:firstRow="1" w:lastColumn="0" w:lastRow="0" w:noHBand="0" w:noVBand="1" w:val="04A0"/>
         <w:tblBorders>
           <w:top w:val="single" w:sz="4" w:space="0" w:color="CBD5E1"/>
           <w:bottom w:val="single" w:sz="4" w:space="0" w:color="CBD5E1"/>
@@ -2029,6 +2027,8 @@
           <w:left w:val="single" w:sz="4" w:space="0" w:color="CBD5E1"/>
           <w:right w:val="single" w:sz="4" w:space="0" w:color="CBD5E1"/>
         </w:tblBorders>
+        <w:tblLayout w:type="fixed"/>
+        <w:tblLook w:firstColumn="1" w:firstRow="1" w:lastColumn="0" w:lastRow="0" w:noHBand="0" w:noVBand="1" w:val="04A0"/>
       </w:tblPr>
       <w:tblGrid>
         <w:gridCol w:w="2617"/>
@@ -2797,8 +2797,6 @@
       <w:tblPr>
         <w:tblW w:type="auto" w:w="0"/>
         <w:jc w:val="center"/>
-        <w:tblLayout w:type="fixed"/>
-        <w:tblLook w:firstColumn="1" w:firstRow="1" w:lastColumn="0" w:lastRow="0" w:noHBand="0" w:noVBand="1" w:val="04A0"/>
         <w:tblBorders>
           <w:top w:val="single" w:sz="4" w:space="0" w:color="CBD5E1"/>
           <w:bottom w:val="single" w:sz="4" w:space="0" w:color="CBD5E1"/>
@@ -2807,6 +2805,8 @@
           <w:left w:val="single" w:sz="4" w:space="0" w:color="CBD5E1"/>
           <w:right w:val="single" w:sz="4" w:space="0" w:color="CBD5E1"/>
         </w:tblBorders>
+        <w:tblLayout w:type="fixed"/>
+        <w:tblLook w:firstColumn="1" w:firstRow="1" w:lastColumn="0" w:lastRow="0" w:noHBand="0" w:noVBand="1" w:val="04A0"/>
       </w:tblPr>
       <w:tblGrid>
         <w:gridCol w:w="5234"/>
@@ -2816,14 +2816,14 @@
         <w:tc>
           <w:tcPr>
             <w:tcW w:type="dxa" w:w="5400"/>
-            <w:vAlign w:val="top"/>
+            <w:shd w:fill="E0F2FE"/>
             <w:tcMar>
               <w:top w:w="120" w:type="dxa"/>
               <w:bottom w:w="120" w:type="dxa"/>
               <w:left w:w="180" w:type="dxa"/>
               <w:right w:w="180" w:type="dxa"/>
             </w:tcMar>
-            <w:shd w:fill="E0F2FE"/>
+            <w:vAlign w:val="top"/>
           </w:tcPr>
           <w:p>
             <w:pPr>
@@ -2842,14 +2842,14 @@
         <w:tc>
           <w:tcPr>
             <w:tcW w:type="dxa" w:w="5400"/>
-            <w:vAlign w:val="top"/>
+            <w:shd w:fill="D1FAE5"/>
             <w:tcMar>
               <w:top w:w="120" w:type="dxa"/>
               <w:bottom w:w="120" w:type="dxa"/>
               <w:left w:w="180" w:type="dxa"/>
               <w:right w:w="180" w:type="dxa"/>
             </w:tcMar>
-            <w:shd w:fill="D1FAE5"/>
+            <w:vAlign w:val="top"/>
           </w:tcPr>
           <w:p>
             <w:pPr>
@@ -2870,14 +2870,14 @@
         <w:tc>
           <w:tcPr>
             <w:tcW w:type="dxa" w:w="5400"/>
-            <w:vAlign w:val="top"/>
+            <w:shd w:fill="F8FAFC"/>
             <w:tcMar>
               <w:top w:w="120" w:type="dxa"/>
               <w:bottom w:w="120" w:type="dxa"/>
               <w:left w:w="180" w:type="dxa"/>
               <w:right w:w="180" w:type="dxa"/>
             </w:tcMar>
-            <w:shd w:fill="F8FAFC"/>
+            <w:vAlign w:val="top"/>
           </w:tcPr>
           <w:p>
             <w:pPr>
@@ -3128,14 +3128,14 @@
         <w:tc>
           <w:tcPr>
             <w:tcW w:type="dxa" w:w="5400"/>
-            <w:vAlign w:val="top"/>
+            <w:shd w:fill="FFFFFF"/>
             <w:tcMar>
               <w:top w:w="120" w:type="dxa"/>
               <w:bottom w:w="120" w:type="dxa"/>
               <w:left w:w="180" w:type="dxa"/>
               <w:right w:w="180" w:type="dxa"/>
             </w:tcMar>
-            <w:shd w:fill="FFFFFF"/>
+            <w:vAlign w:val="top"/>
           </w:tcPr>
           <w:p>
             <w:pPr>
@@ -3394,8 +3394,6 @@
       <w:tblPr>
         <w:tblW w:type="auto" w:w="0"/>
         <w:jc w:val="center"/>
-        <w:tblLayout w:type="fixed"/>
-        <w:tblLook w:firstColumn="1" w:firstRow="1" w:lastColumn="0" w:lastRow="0" w:noHBand="0" w:noVBand="1" w:val="04A0"/>
         <w:tblBorders>
           <w:top w:val="single" w:sz="6" w:space="0" w:color="334155"/>
           <w:bottom w:val="single" w:sz="6" w:space="0" w:color="334155"/>
@@ -3404,6 +3402,8 @@
           <w:left w:val="single" w:sz="6" w:space="0" w:color="334155"/>
           <w:right w:val="single" w:sz="6" w:space="0" w:color="334155"/>
         </w:tblBorders>
+        <w:tblLayout w:type="fixed"/>
+        <w:tblLook w:firstColumn="1" w:firstRow="1" w:lastColumn="0" w:lastRow="0" w:noHBand="0" w:noVBand="1" w:val="04A0"/>
       </w:tblPr>
       <w:tblGrid>
         <w:gridCol w:w="10469"/>
@@ -3486,8 +3486,6 @@
       <w:tblPr>
         <w:tblW w:type="auto" w:w="0"/>
         <w:jc w:val="center"/>
-        <w:tblLayout w:type="fixed"/>
-        <w:tblLook w:firstColumn="1" w:firstRow="1" w:lastColumn="0" w:lastRow="0" w:noHBand="0" w:noVBand="1" w:val="04A0"/>
         <w:tblBorders>
           <w:top w:val="single" w:sz="4" w:space="0" w:color="CBD5E1"/>
           <w:bottom w:val="single" w:sz="4" w:space="0" w:color="CBD5E1"/>
@@ -3496,6 +3494,8 @@
           <w:left w:val="single" w:sz="4" w:space="0" w:color="CBD5E1"/>
           <w:right w:val="single" w:sz="4" w:space="0" w:color="CBD5E1"/>
         </w:tblBorders>
+        <w:tblLayout w:type="fixed"/>
+        <w:tblLook w:firstColumn="1" w:firstRow="1" w:lastColumn="0" w:lastRow="0" w:noHBand="0" w:noVBand="1" w:val="04A0"/>
       </w:tblPr>
       <w:tblGrid>
         <w:gridCol w:w="5234"/>
@@ -3505,14 +3505,14 @@
         <w:tc>
           <w:tcPr>
             <w:tcW w:type="dxa" w:w="5400"/>
-            <w:vAlign w:val="top"/>
+            <w:shd w:fill="E0F2FE"/>
             <w:tcMar>
               <w:top w:w="120" w:type="dxa"/>
               <w:bottom w:w="120" w:type="dxa"/>
               <w:left w:w="180" w:type="dxa"/>
               <w:right w:w="180" w:type="dxa"/>
             </w:tcMar>
-            <w:shd w:fill="E0F2FE"/>
+            <w:vAlign w:val="top"/>
           </w:tcPr>
           <w:p>
             <w:pPr>
@@ -3531,14 +3531,14 @@
         <w:tc>
           <w:tcPr>
             <w:tcW w:type="dxa" w:w="5400"/>
-            <w:vAlign w:val="top"/>
+            <w:shd w:fill="D1FAE5"/>
             <w:tcMar>
               <w:top w:w="120" w:type="dxa"/>
               <w:bottom w:w="120" w:type="dxa"/>
               <w:left w:w="180" w:type="dxa"/>
               <w:right w:w="180" w:type="dxa"/>
             </w:tcMar>
-            <w:shd w:fill="D1FAE5"/>
+            <w:vAlign w:val="top"/>
           </w:tcPr>
           <w:p>
             <w:pPr>
@@ -3559,14 +3559,14 @@
         <w:tc>
           <w:tcPr>
             <w:tcW w:type="dxa" w:w="5400"/>
-            <w:vAlign w:val="top"/>
+            <w:shd w:fill="F8FAFC"/>
             <w:tcMar>
               <w:top w:w="120" w:type="dxa"/>
               <w:bottom w:w="120" w:type="dxa"/>
               <w:left w:w="180" w:type="dxa"/>
               <w:right w:w="180" w:type="dxa"/>
             </w:tcMar>
-            <w:shd w:fill="F8FAFC"/>
+            <w:vAlign w:val="top"/>
           </w:tcPr>
           <w:p>
             <w:pPr>
@@ -3762,14 +3762,14 @@
         <w:tc>
           <w:tcPr>
             <w:tcW w:type="dxa" w:w="5400"/>
-            <w:vAlign w:val="top"/>
+            <w:shd w:fill="FFFFFF"/>
             <w:tcMar>
               <w:top w:w="120" w:type="dxa"/>
               <w:bottom w:w="120" w:type="dxa"/>
               <w:left w:w="180" w:type="dxa"/>
               <w:right w:w="180" w:type="dxa"/>
             </w:tcMar>
-            <w:shd w:fill="FFFFFF"/>
+            <w:vAlign w:val="top"/>
           </w:tcPr>
           <w:p>
             <w:pPr>
@@ -3973,8 +3973,6 @@
       <w:tblPr>
         <w:tblW w:type="auto" w:w="0"/>
         <w:jc w:val="center"/>
-        <w:tblLayout w:type="fixed"/>
-        <w:tblLook w:firstColumn="1" w:firstRow="1" w:lastColumn="0" w:lastRow="0" w:noHBand="0" w:noVBand="1" w:val="04A0"/>
         <w:tblBorders>
           <w:top w:val="single" w:sz="6" w:space="0" w:color="334155"/>
           <w:bottom w:val="single" w:sz="6" w:space="0" w:color="334155"/>
@@ -3983,6 +3981,8 @@
           <w:left w:val="single" w:sz="6" w:space="0" w:color="334155"/>
           <w:right w:val="single" w:sz="6" w:space="0" w:color="334155"/>
         </w:tblBorders>
+        <w:tblLayout w:type="fixed"/>
+        <w:tblLook w:firstColumn="1" w:firstRow="1" w:lastColumn="0" w:lastRow="0" w:noHBand="0" w:noVBand="1" w:val="04A0"/>
       </w:tblPr>
       <w:tblGrid>
         <w:gridCol w:w="10469"/>
@@ -4039,8 +4039,6 @@
       <w:tblPr>
         <w:tblW w:type="auto" w:w="0"/>
         <w:jc w:val="center"/>
-        <w:tblLayout w:type="fixed"/>
-        <w:tblLook w:firstColumn="1" w:firstRow="1" w:lastColumn="0" w:lastRow="0" w:noHBand="0" w:noVBand="1" w:val="04A0"/>
         <w:tblBorders>
           <w:top w:val="single" w:sz="4" w:space="0" w:color="CBD5E1"/>
           <w:bottom w:val="single" w:sz="4" w:space="0" w:color="CBD5E1"/>
@@ -4049,6 +4047,8 @@
           <w:left w:val="single" w:sz="4" w:space="0" w:color="CBD5E1"/>
           <w:right w:val="single" w:sz="4" w:space="0" w:color="CBD5E1"/>
         </w:tblBorders>
+        <w:tblLayout w:type="fixed"/>
+        <w:tblLook w:firstColumn="1" w:firstRow="1" w:lastColumn="0" w:lastRow="0" w:noHBand="0" w:noVBand="1" w:val="04A0"/>
       </w:tblPr>
       <w:tblGrid>
         <w:gridCol w:w="5234"/>
@@ -4058,14 +4058,14 @@
         <w:tc>
           <w:tcPr>
             <w:tcW w:type="dxa" w:w="5400"/>
-            <w:vAlign w:val="top"/>
+            <w:shd w:fill="E0F2FE"/>
             <w:tcMar>
               <w:top w:w="120" w:type="dxa"/>
               <w:bottom w:w="120" w:type="dxa"/>
               <w:left w:w="180" w:type="dxa"/>
               <w:right w:w="180" w:type="dxa"/>
             </w:tcMar>
-            <w:shd w:fill="E0F2FE"/>
+            <w:vAlign w:val="top"/>
           </w:tcPr>
           <w:p>
             <w:pPr>
@@ -4084,14 +4084,14 @@
         <w:tc>
           <w:tcPr>
             <w:tcW w:type="dxa" w:w="5400"/>
-            <w:vAlign w:val="top"/>
+            <w:shd w:fill="D1FAE5"/>
             <w:tcMar>
               <w:top w:w="120" w:type="dxa"/>
               <w:bottom w:w="120" w:type="dxa"/>
               <w:left w:w="180" w:type="dxa"/>
               <w:right w:w="180" w:type="dxa"/>
             </w:tcMar>
-            <w:shd w:fill="D1FAE5"/>
+            <w:vAlign w:val="top"/>
           </w:tcPr>
           <w:p>
             <w:pPr>
@@ -4112,14 +4112,14 @@
         <w:tc>
           <w:tcPr>
             <w:tcW w:type="dxa" w:w="5400"/>
-            <w:vAlign w:val="top"/>
+            <w:shd w:fill="F8FAFC"/>
             <w:tcMar>
               <w:top w:w="120" w:type="dxa"/>
               <w:bottom w:w="120" w:type="dxa"/>
               <w:left w:w="180" w:type="dxa"/>
               <w:right w:w="180" w:type="dxa"/>
             </w:tcMar>
-            <w:shd w:fill="F8FAFC"/>
+            <w:vAlign w:val="top"/>
           </w:tcPr>
           <w:p>
             <w:pPr>
@@ -4308,14 +4308,14 @@
         <w:tc>
           <w:tcPr>
             <w:tcW w:type="dxa" w:w="5400"/>
-            <w:vAlign w:val="top"/>
+            <w:shd w:fill="FFFFFF"/>
             <w:tcMar>
               <w:top w:w="120" w:type="dxa"/>
               <w:bottom w:w="120" w:type="dxa"/>
               <w:left w:w="180" w:type="dxa"/>
               <w:right w:w="180" w:type="dxa"/>
             </w:tcMar>
-            <w:shd w:fill="FFFFFF"/>
+            <w:vAlign w:val="top"/>
           </w:tcPr>
           <w:p>
             <w:pPr>
@@ -4527,8 +4527,6 @@
       <w:tblPr>
         <w:tblW w:type="auto" w:w="0"/>
         <w:jc w:val="center"/>
-        <w:tblLayout w:type="fixed"/>
-        <w:tblLook w:firstColumn="1" w:firstRow="1" w:lastColumn="0" w:lastRow="0" w:noHBand="0" w:noVBand="1" w:val="04A0"/>
         <w:tblBorders>
           <w:top w:val="single" w:sz="4" w:space="0" w:color="CBD5E1"/>
           <w:bottom w:val="single" w:sz="4" w:space="0" w:color="CBD5E1"/>
@@ -4537,6 +4535,8 @@
           <w:left w:val="single" w:sz="4" w:space="0" w:color="CBD5E1"/>
           <w:right w:val="single" w:sz="4" w:space="0" w:color="CBD5E1"/>
         </w:tblBorders>
+        <w:tblLayout w:type="fixed"/>
+        <w:tblLook w:firstColumn="1" w:firstRow="1" w:lastColumn="0" w:lastRow="0" w:noHBand="0" w:noVBand="1" w:val="04A0"/>
       </w:tblPr>
       <w:tblGrid>
         <w:gridCol w:w="5234"/>
@@ -4546,14 +4546,14 @@
         <w:tc>
           <w:tcPr>
             <w:tcW w:type="dxa" w:w="5400"/>
-            <w:vAlign w:val="top"/>
+            <w:shd w:fill="E0F2FE"/>
             <w:tcMar>
               <w:top w:w="120" w:type="dxa"/>
               <w:bottom w:w="120" w:type="dxa"/>
               <w:left w:w="180" w:type="dxa"/>
               <w:right w:w="180" w:type="dxa"/>
             </w:tcMar>
-            <w:shd w:fill="E0F2FE"/>
+            <w:vAlign w:val="top"/>
           </w:tcPr>
           <w:p>
             <w:pPr>
@@ -4572,14 +4572,14 @@
         <w:tc>
           <w:tcPr>
             <w:tcW w:type="dxa" w:w="5400"/>
-            <w:vAlign w:val="top"/>
+            <w:shd w:fill="D1FAE5"/>
             <w:tcMar>
               <w:top w:w="120" w:type="dxa"/>
               <w:bottom w:w="120" w:type="dxa"/>
               <w:left w:w="180" w:type="dxa"/>
               <w:right w:w="180" w:type="dxa"/>
             </w:tcMar>
-            <w:shd w:fill="D1FAE5"/>
+            <w:vAlign w:val="top"/>
           </w:tcPr>
           <w:p>
             <w:pPr>
@@ -4600,14 +4600,14 @@
         <w:tc>
           <w:tcPr>
             <w:tcW w:type="dxa" w:w="5400"/>
-            <w:vAlign w:val="top"/>
+            <w:shd w:fill="F8FAFC"/>
             <w:tcMar>
               <w:top w:w="120" w:type="dxa"/>
               <w:bottom w:w="120" w:type="dxa"/>
               <w:left w:w="180" w:type="dxa"/>
               <w:right w:w="180" w:type="dxa"/>
             </w:tcMar>
-            <w:shd w:fill="F8FAFC"/>
+            <w:vAlign w:val="top"/>
           </w:tcPr>
           <w:p>
             <w:pPr>
@@ -4755,14 +4755,14 @@
         <w:tc>
           <w:tcPr>
             <w:tcW w:type="dxa" w:w="5400"/>
-            <w:vAlign w:val="top"/>
+            <w:shd w:fill="FFFFFF"/>
             <w:tcMar>
               <w:top w:w="120" w:type="dxa"/>
               <w:bottom w:w="120" w:type="dxa"/>
               <w:left w:w="180" w:type="dxa"/>
               <w:right w:w="180" w:type="dxa"/>
             </w:tcMar>
-            <w:shd w:fill="FFFFFF"/>
+            <w:vAlign w:val="top"/>
           </w:tcPr>
           <w:p>
             <w:pPr>
@@ -4933,8 +4933,6 @@
       <w:tblPr>
         <w:tblW w:type="auto" w:w="0"/>
         <w:jc w:val="center"/>
-        <w:tblLayout w:type="fixed"/>
-        <w:tblLook w:firstColumn="1" w:firstRow="1" w:lastColumn="0" w:lastRow="0" w:noHBand="0" w:noVBand="1" w:val="04A0"/>
         <w:tblBorders>
           <w:top w:val="single" w:sz="4" w:space="0" w:color="CBD5E1"/>
           <w:bottom w:val="single" w:sz="4" w:space="0" w:color="CBD5E1"/>
@@ -4943,6 +4941,8 @@
           <w:left w:val="single" w:sz="4" w:space="0" w:color="CBD5E1"/>
           <w:right w:val="single" w:sz="4" w:space="0" w:color="CBD5E1"/>
         </w:tblBorders>
+        <w:tblLayout w:type="fixed"/>
+        <w:tblLook w:firstColumn="1" w:firstRow="1" w:lastColumn="0" w:lastRow="0" w:noHBand="0" w:noVBand="1" w:val="04A0"/>
       </w:tblPr>
       <w:tblGrid>
         <w:gridCol w:w="5234"/>
@@ -5319,8 +5319,6 @@
       <w:tblPr>
         <w:tblW w:type="auto" w:w="0"/>
         <w:jc w:val="center"/>
-        <w:tblLayout w:type="fixed"/>
-        <w:tblLook w:firstColumn="1" w:firstRow="1" w:lastColumn="0" w:lastRow="0" w:noHBand="0" w:noVBand="1" w:val="04A0"/>
         <w:tblBorders>
           <w:top w:val="single" w:sz="4" w:space="0" w:color="CBD5E1"/>
           <w:bottom w:val="single" w:sz="4" w:space="0" w:color="CBD5E1"/>
@@ -5329,6 +5327,8 @@
           <w:left w:val="single" w:sz="4" w:space="0" w:color="CBD5E1"/>
           <w:right w:val="single" w:sz="4" w:space="0" w:color="CBD5E1"/>
         </w:tblBorders>
+        <w:tblLayout w:type="fixed"/>
+        <w:tblLook w:firstColumn="1" w:firstRow="1" w:lastColumn="0" w:lastRow="0" w:noHBand="0" w:noVBand="1" w:val="04A0"/>
       </w:tblPr>
       <w:tblGrid>
         <w:gridCol w:w="5234"/>
@@ -5338,14 +5338,14 @@
         <w:tc>
           <w:tcPr>
             <w:tcW w:type="dxa" w:w="5400"/>
-            <w:vAlign w:val="top"/>
+            <w:shd w:fill="E0F2FE"/>
             <w:tcMar>
               <w:top w:w="120" w:type="dxa"/>
               <w:bottom w:w="120" w:type="dxa"/>
               <w:left w:w="180" w:type="dxa"/>
               <w:right w:w="180" w:type="dxa"/>
             </w:tcMar>
-            <w:shd w:fill="E0F2FE"/>
+            <w:vAlign w:val="top"/>
           </w:tcPr>
           <w:p>
             <w:pPr>
@@ -5364,14 +5364,14 @@
         <w:tc>
           <w:tcPr>
             <w:tcW w:type="dxa" w:w="5400"/>
-            <w:vAlign w:val="top"/>
+            <w:shd w:fill="D1FAE5"/>
             <w:tcMar>
               <w:top w:w="120" w:type="dxa"/>
               <w:bottom w:w="120" w:type="dxa"/>
               <w:left w:w="180" w:type="dxa"/>
               <w:right w:w="180" w:type="dxa"/>
             </w:tcMar>
-            <w:shd w:fill="D1FAE5"/>
+            <w:vAlign w:val="top"/>
           </w:tcPr>
           <w:p>
             <w:pPr>
@@ -5392,14 +5392,14 @@
         <w:tc>
           <w:tcPr>
             <w:tcW w:type="dxa" w:w="5400"/>
-            <w:vAlign w:val="top"/>
+            <w:shd w:fill="F8FAFC"/>
             <w:tcMar>
               <w:top w:w="120" w:type="dxa"/>
               <w:bottom w:w="120" w:type="dxa"/>
               <w:left w:w="180" w:type="dxa"/>
               <w:right w:w="180" w:type="dxa"/>
             </w:tcMar>
-            <w:shd w:fill="F8FAFC"/>
+            <w:vAlign w:val="top"/>
           </w:tcPr>
           <w:p>
             <w:pPr>
@@ -5576,14 +5576,14 @@
         <w:tc>
           <w:tcPr>
             <w:tcW w:type="dxa" w:w="5400"/>
-            <w:vAlign w:val="top"/>
+            <w:shd w:fill="FFFFFF"/>
             <w:tcMar>
               <w:top w:w="120" w:type="dxa"/>
               <w:bottom w:w="120" w:type="dxa"/>
               <w:left w:w="180" w:type="dxa"/>
               <w:right w:w="180" w:type="dxa"/>
             </w:tcMar>
-            <w:shd w:fill="FFFFFF"/>
+            <w:vAlign w:val="top"/>
           </w:tcPr>
           <w:p>
             <w:pPr>
@@ -5783,8 +5783,6 @@
       <w:tblPr>
         <w:tblW w:type="auto" w:w="0"/>
         <w:jc w:val="center"/>
-        <w:tblLayout w:type="fixed"/>
-        <w:tblLook w:firstColumn="1" w:firstRow="1" w:lastColumn="0" w:lastRow="0" w:noHBand="0" w:noVBand="1" w:val="04A0"/>
         <w:tblBorders>
           <w:top w:val="single" w:sz="4" w:space="0" w:color="CBD5E1"/>
           <w:bottom w:val="single" w:sz="4" w:space="0" w:color="CBD5E1"/>
@@ -5793,6 +5791,8 @@
           <w:left w:val="single" w:sz="4" w:space="0" w:color="CBD5E1"/>
           <w:right w:val="single" w:sz="4" w:space="0" w:color="CBD5E1"/>
         </w:tblBorders>
+        <w:tblLayout w:type="fixed"/>
+        <w:tblLook w:firstColumn="1" w:firstRow="1" w:lastColumn="0" w:lastRow="0" w:noHBand="0" w:noVBand="1" w:val="04A0"/>
       </w:tblPr>
       <w:tblGrid>
         <w:gridCol w:w="5234"/>
@@ -5802,14 +5802,14 @@
         <w:tc>
           <w:tcPr>
             <w:tcW w:type="dxa" w:w="5400"/>
-            <w:vAlign w:val="top"/>
+            <w:shd w:fill="E0F2FE"/>
             <w:tcMar>
               <w:top w:w="120" w:type="dxa"/>
               <w:bottom w:w="120" w:type="dxa"/>
               <w:left w:w="180" w:type="dxa"/>
               <w:right w:w="180" w:type="dxa"/>
             </w:tcMar>
-            <w:shd w:fill="E0F2FE"/>
+            <w:vAlign w:val="top"/>
           </w:tcPr>
           <w:p>
             <w:pPr>
@@ -5828,14 +5828,14 @@
         <w:tc>
           <w:tcPr>
             <w:tcW w:type="dxa" w:w="5400"/>
-            <w:vAlign w:val="top"/>
+            <w:shd w:fill="D1FAE5"/>
             <w:tcMar>
               <w:top w:w="120" w:type="dxa"/>
               <w:bottom w:w="120" w:type="dxa"/>
               <w:left w:w="180" w:type="dxa"/>
               <w:right w:w="180" w:type="dxa"/>
             </w:tcMar>
-            <w:shd w:fill="D1FAE5"/>
+            <w:vAlign w:val="top"/>
           </w:tcPr>
           <w:p>
             <w:pPr>
@@ -5856,14 +5856,14 @@
         <w:tc>
           <w:tcPr>
             <w:tcW w:type="dxa" w:w="5400"/>
-            <w:vAlign w:val="top"/>
+            <w:shd w:fill="F8FAFC"/>
             <w:tcMar>
               <w:top w:w="120" w:type="dxa"/>
               <w:bottom w:w="120" w:type="dxa"/>
               <w:left w:w="180" w:type="dxa"/>
               <w:right w:w="180" w:type="dxa"/>
             </w:tcMar>
-            <w:shd w:fill="F8FAFC"/>
+            <w:vAlign w:val="top"/>
           </w:tcPr>
           <w:p>
             <w:pPr>
@@ -6129,14 +6129,14 @@
         <w:tc>
           <w:tcPr>
             <w:tcW w:type="dxa" w:w="5400"/>
-            <w:vAlign w:val="top"/>
+            <w:shd w:fill="FFFFFF"/>
             <w:tcMar>
               <w:top w:w="120" w:type="dxa"/>
               <w:bottom w:w="120" w:type="dxa"/>
               <w:left w:w="180" w:type="dxa"/>
               <w:right w:w="180" w:type="dxa"/>
             </w:tcMar>
-            <w:shd w:fill="FFFFFF"/>
+            <w:vAlign w:val="top"/>
           </w:tcPr>
           <w:p>
             <w:pPr>
@@ -6425,8 +6425,6 @@
       <w:tblPr>
         <w:tblW w:type="auto" w:w="0"/>
         <w:jc w:val="center"/>
-        <w:tblLayout w:type="fixed"/>
-        <w:tblLook w:firstColumn="1" w:firstRow="1" w:lastColumn="0" w:lastRow="0" w:noHBand="0" w:noVBand="1" w:val="04A0"/>
         <w:tblBorders>
           <w:top w:val="single" w:sz="4" w:space="0" w:color="CBD5E1"/>
           <w:bottom w:val="single" w:sz="4" w:space="0" w:color="CBD5E1"/>
@@ -6435,6 +6433,8 @@
           <w:left w:val="single" w:sz="4" w:space="0" w:color="CBD5E1"/>
           <w:right w:val="single" w:sz="4" w:space="0" w:color="CBD5E1"/>
         </w:tblBorders>
+        <w:tblLayout w:type="fixed"/>
+        <w:tblLook w:firstColumn="1" w:firstRow="1" w:lastColumn="0" w:lastRow="0" w:noHBand="0" w:noVBand="1" w:val="04A0"/>
       </w:tblPr>
       <w:tblGrid>
         <w:gridCol w:w="5234"/>
@@ -6444,14 +6444,14 @@
         <w:tc>
           <w:tcPr>
             <w:tcW w:type="dxa" w:w="5400"/>
-            <w:vAlign w:val="top"/>
+            <w:shd w:fill="E0F2FE"/>
             <w:tcMar>
               <w:top w:w="120" w:type="dxa"/>
               <w:bottom w:w="120" w:type="dxa"/>
               <w:left w:w="180" w:type="dxa"/>
               <w:right w:w="180" w:type="dxa"/>
             </w:tcMar>
-            <w:shd w:fill="E0F2FE"/>
+            <w:vAlign w:val="top"/>
           </w:tcPr>
           <w:p>
             <w:pPr>
@@ -6470,14 +6470,14 @@
         <w:tc>
           <w:tcPr>
             <w:tcW w:type="dxa" w:w="5400"/>
-            <w:vAlign w:val="top"/>
+            <w:shd w:fill="D1FAE5"/>
             <w:tcMar>
               <w:top w:w="120" w:type="dxa"/>
               <w:bottom w:w="120" w:type="dxa"/>
               <w:left w:w="180" w:type="dxa"/>
               <w:right w:w="180" w:type="dxa"/>
             </w:tcMar>
-            <w:shd w:fill="D1FAE5"/>
+            <w:vAlign w:val="top"/>
           </w:tcPr>
           <w:p>
             <w:pPr>
@@ -6498,14 +6498,14 @@
         <w:tc>
           <w:tcPr>
             <w:tcW w:type="dxa" w:w="5400"/>
-            <w:vAlign w:val="top"/>
+            <w:shd w:fill="F8FAFC"/>
             <w:tcMar>
               <w:top w:w="120" w:type="dxa"/>
               <w:bottom w:w="120" w:type="dxa"/>
               <w:left w:w="180" w:type="dxa"/>
               <w:right w:w="180" w:type="dxa"/>
             </w:tcMar>
-            <w:shd w:fill="F8FAFC"/>
+            <w:vAlign w:val="top"/>
           </w:tcPr>
           <w:p>
             <w:pPr>
@@ -6589,14 +6589,14 @@
         <w:tc>
           <w:tcPr>
             <w:tcW w:type="dxa" w:w="5400"/>
-            <w:vAlign w:val="top"/>
+            <w:shd w:fill="FFFFFF"/>
             <w:tcMar>
               <w:top w:w="120" w:type="dxa"/>
               <w:bottom w:w="120" w:type="dxa"/>
               <w:left w:w="180" w:type="dxa"/>
               <w:right w:w="180" w:type="dxa"/>
             </w:tcMar>
-            <w:shd w:fill="FFFFFF"/>
+            <w:vAlign w:val="top"/>
           </w:tcPr>
           <w:p>
             <w:pPr>
@@ -6688,8 +6688,6 @@
       <w:tblPr>
         <w:tblW w:type="auto" w:w="0"/>
         <w:jc w:val="center"/>
-        <w:tblLayout w:type="fixed"/>
-        <w:tblLook w:firstColumn="1" w:firstRow="1" w:lastColumn="0" w:lastRow="0" w:noHBand="0" w:noVBand="1" w:val="04A0"/>
         <w:tblBorders>
           <w:top w:val="single" w:sz="4" w:space="0" w:color="CBD5E1"/>
           <w:bottom w:val="single" w:sz="4" w:space="0" w:color="CBD5E1"/>
@@ -6698,6 +6696,8 @@
           <w:left w:val="single" w:sz="4" w:space="0" w:color="CBD5E1"/>
           <w:right w:val="single" w:sz="4" w:space="0" w:color="CBD5E1"/>
         </w:tblBorders>
+        <w:tblLayout w:type="fixed"/>
+        <w:tblLook w:firstColumn="1" w:firstRow="1" w:lastColumn="0" w:lastRow="0" w:noHBand="0" w:noVBand="1" w:val="04A0"/>
       </w:tblPr>
       <w:tblGrid>
         <w:gridCol w:w="3490"/>

</xml_diff>